<commit_message>
Deploy 2026-08-17 14:21 — 38 file(s) updated
</commit_message>
<xml_diff>
--- a/Travel Stories.docx
+++ b/Travel Stories.docx
@@ -34,7 +34,11 @@
         </w:rPr>
       </w:pPr>
       <w:r>
-        <w:rPr/>
+        <w:rPr>
+          <w:rFonts w:ascii="Times New Roman" w:hAnsi="Times New Roman"/>
+          <w:b w:val="false"/>
+          <w:bCs w:val="false"/>
+        </w:rPr>
       </w:r>
     </w:p>
     <w:p>
@@ -1062,6 +1066,510 @@
           <w:sz w:val="24"/>
           <w:szCs w:val="24"/>
         </w:rPr>
+      </w:r>
+      <w:r>
+        <w:br w:type="page"/>
+      </w:r>
+    </w:p>
+    <w:p>
+      <w:pPr>
+        <w:pStyle w:val="Normal"/>
+        <w:bidi w:val="0"/>
+        <w:spacing w:lineRule="auto" w:line="240" w:before="0" w:after="0"/>
+        <w:jc w:val="left"/>
+        <w:rPr>
+          <w:rFonts w:ascii="Times New Roman" w:hAnsi="Times New Roman"/>
+          <w:b/>
+          <w:bCs/>
+          <w:sz w:val="24"/>
+          <w:szCs w:val="24"/>
+        </w:rPr>
+      </w:pPr>
+      <w:r>
+        <w:rPr>
+          <w:rFonts w:ascii="Times New Roman" w:hAnsi="Times New Roman"/>
+          <w:b/>
+          <w:bCs/>
+          <w:sz w:val="24"/>
+          <w:szCs w:val="24"/>
+        </w:rPr>
+        <w:t>Heaven on Earth – Valley of Flowers, Chamoli District, Uttrakhand – August 2026</w:t>
+      </w:r>
+    </w:p>
+    <w:p>
+      <w:pPr>
+        <w:pStyle w:val="Normal"/>
+        <w:bidi w:val="0"/>
+        <w:spacing w:lineRule="auto" w:line="240" w:before="0" w:after="0"/>
+        <w:jc w:val="left"/>
+        <w:rPr>
+          <w:rFonts w:ascii="Times New Roman" w:hAnsi="Times New Roman"/>
+          <w:b/>
+          <w:bCs/>
+          <w:sz w:val="24"/>
+          <w:szCs w:val="24"/>
+        </w:rPr>
+      </w:pPr>
+      <w:r>
+        <w:rPr>
+          <w:rFonts w:ascii="Times New Roman" w:hAnsi="Times New Roman"/>
+          <w:b/>
+          <w:bCs/>
+          <w:sz w:val="24"/>
+          <w:szCs w:val="24"/>
+        </w:rPr>
+      </w:r>
+    </w:p>
+    <w:p>
+      <w:pPr>
+        <w:pStyle w:val="Normal"/>
+        <w:bidi w:val="0"/>
+        <w:spacing w:lineRule="auto" w:line="240" w:before="0" w:after="0"/>
+        <w:jc w:val="left"/>
+        <w:rPr>
+          <w:rFonts w:ascii="Times New Roman" w:hAnsi="Times New Roman"/>
+          <w:b/>
+          <w:bCs/>
+          <w:sz w:val="24"/>
+          <w:szCs w:val="24"/>
+        </w:rPr>
+      </w:pPr>
+      <w:r>
+        <w:rPr>
+          <w:rFonts w:ascii="Times New Roman" w:hAnsi="Times New Roman"/>
+          <w:b/>
+          <w:bCs/>
+          <w:sz w:val="24"/>
+          <w:szCs w:val="24"/>
+        </w:rPr>
+        <w:t>Part 1 – Badrinath – Vasudhara Falls</w:t>
+      </w:r>
+    </w:p>
+    <w:p>
+      <w:pPr>
+        <w:pStyle w:val="Normal"/>
+        <w:spacing w:lineRule="auto" w:line="240"/>
+        <w:rPr>
+          <w:rFonts w:ascii="Times New Roman" w:hAnsi="Times New Roman"/>
+          <w:b/>
+          <w:bCs/>
+        </w:rPr>
+      </w:pPr>
+      <w:r>
+        <w:rPr>
+          <w:rFonts w:ascii="Times New Roman" w:hAnsi="Times New Roman"/>
+          <w:b/>
+          <w:bCs/>
+        </w:rPr>
+      </w:r>
+    </w:p>
+    <w:p>
+      <w:pPr>
+        <w:pStyle w:val="BodyText"/>
+        <w:bidi w:val="0"/>
+        <w:spacing w:lineRule="auto" w:line="240" w:before="0" w:after="0"/>
+        <w:jc w:val="left"/>
+        <w:rPr>
+          <w:rFonts w:ascii="Times New Roman" w:hAnsi="Times New Roman"/>
+          <w:b w:val="false"/>
+          <w:bCs w:val="false"/>
+          <w:sz w:val="24"/>
+          <w:szCs w:val="24"/>
+        </w:rPr>
+      </w:pPr>
+      <w:r>
+        <w:rPr>
+          <w:rFonts w:ascii="Times New Roman" w:hAnsi="Times New Roman"/>
+          <w:b w:val="false"/>
+          <w:bCs w:val="false"/>
+          <w:sz w:val="24"/>
+          <w:szCs w:val="24"/>
+        </w:rPr>
+        <w:t>My sincere gratitude to the Almighty in fulfilling a promise I made to my wife 18 years back! Yes, the last time I visited this amazing place was in 2008, and unfortunately, my wife had to drop out of this trip at the last minute. Time has flown fast and furious, and it occurred to me that each year I am getting older, and so is my wife! So, I had to make up my mind because I am no longer in my early 40s. I am as young as I could be at 63, and my wife at 59; it became clear that I had to take her to this place this year, now, this August. And, yes, we did it—together—fighting against all odds. Yes: my aging knee, a stomach infection that my wife brought with her from Delhi, the risks and challenges of the July monsoon, particularly in the Himalayan region, etc.</w:t>
+      </w:r>
+    </w:p>
+    <w:p>
+      <w:pPr>
+        <w:pStyle w:val="BodyText"/>
+        <w:bidi w:val="0"/>
+        <w:spacing w:lineRule="auto" w:line="240" w:before="0" w:after="0"/>
+        <w:jc w:val="left"/>
+        <w:rPr>
+          <w:rFonts w:ascii="Times New Roman" w:hAnsi="Times New Roman"/>
+          <w:b w:val="false"/>
+          <w:bCs w:val="false"/>
+          <w:sz w:val="24"/>
+          <w:szCs w:val="24"/>
+        </w:rPr>
+      </w:pPr>
+      <w:r>
+        <w:rPr>
+          <w:rFonts w:ascii="Times New Roman" w:hAnsi="Times New Roman"/>
+          <w:b w:val="false"/>
+          <w:bCs w:val="false"/>
+          <w:sz w:val="24"/>
+          <w:szCs w:val="24"/>
+        </w:rPr>
+      </w:r>
+    </w:p>
+    <w:p>
+      <w:pPr>
+        <w:pStyle w:val="BodyText"/>
+        <w:spacing w:lineRule="auto" w:line="240" w:before="0" w:after="0"/>
+        <w:rPr>
+          <w:rFonts w:ascii="Times New Roman" w:hAnsi="Times New Roman"/>
+        </w:rPr>
+      </w:pPr>
+      <w:r>
+        <w:rPr>
+          <w:rFonts w:ascii="Times New Roman" w:hAnsi="Times New Roman"/>
+        </w:rPr>
+        <w:t>The itinerary was very straightforward. Our idea was not to exert and to enjoy the trip in a relaxed manner, without rushing and taking adequate halts in between. The bottom line was not to take any chance that might cause fatigue! With that in mind, we made some extra pit stops that would not have been part of the itinerary a couple of decades ago. It is more a matter of the will of the mind than the body!</w:t>
+      </w:r>
+    </w:p>
+    <w:p>
+      <w:pPr>
+        <w:pStyle w:val="BodyText"/>
+        <w:numPr>
+          <w:ilvl w:val="0"/>
+          <w:numId w:val="2"/>
+        </w:numPr>
+        <w:tabs>
+          <w:tab w:val="clear" w:pos="709"/>
+          <w:tab w:val="left" w:pos="0" w:leader="none"/>
+        </w:tabs>
+        <w:spacing w:lineRule="auto" w:line="240" w:before="0" w:after="0"/>
+        <w:ind w:hanging="283" w:left="709"/>
+        <w:rPr>
+          <w:rFonts w:ascii="Times New Roman" w:hAnsi="Times New Roman"/>
+        </w:rPr>
+      </w:pPr>
+      <w:r>
+        <w:rPr>
+          <w:rFonts w:ascii="Times New Roman" w:hAnsi="Times New Roman"/>
+        </w:rPr>
+        <w:t>Delhi to Haridwar (by train) and overnight stay</w:t>
+      </w:r>
+    </w:p>
+    <w:p>
+      <w:pPr>
+        <w:pStyle w:val="BodyText"/>
+        <w:numPr>
+          <w:ilvl w:val="0"/>
+          <w:numId w:val="2"/>
+        </w:numPr>
+        <w:tabs>
+          <w:tab w:val="clear" w:pos="709"/>
+          <w:tab w:val="left" w:pos="0" w:leader="none"/>
+        </w:tabs>
+        <w:spacing w:lineRule="auto" w:line="240" w:before="0" w:after="0"/>
+        <w:ind w:hanging="283" w:left="709"/>
+        <w:rPr>
+          <w:rFonts w:ascii="Times New Roman" w:hAnsi="Times New Roman"/>
+        </w:rPr>
+      </w:pPr>
+      <w:r>
+        <w:rPr>
+          <w:rFonts w:ascii="Times New Roman" w:hAnsi="Times New Roman"/>
+        </w:rPr>
+        <w:t>Haridwar to Pipalkoti (overnight stay)</w:t>
+      </w:r>
+    </w:p>
+    <w:p>
+      <w:pPr>
+        <w:pStyle w:val="BodyText"/>
+        <w:numPr>
+          <w:ilvl w:val="0"/>
+          <w:numId w:val="2"/>
+        </w:numPr>
+        <w:tabs>
+          <w:tab w:val="clear" w:pos="709"/>
+          <w:tab w:val="left" w:pos="0" w:leader="none"/>
+        </w:tabs>
+        <w:spacing w:lineRule="auto" w:line="240" w:before="0" w:after="0"/>
+        <w:ind w:hanging="283" w:left="709"/>
+        <w:rPr>
+          <w:rFonts w:ascii="Times New Roman" w:hAnsi="Times New Roman"/>
+        </w:rPr>
+      </w:pPr>
+      <w:r>
+        <w:rPr>
+          <w:rFonts w:ascii="Times New Roman" w:hAnsi="Times New Roman"/>
+        </w:rPr>
+        <w:t>Pipalkoti to Badrinath (overnight stay) and trek to Mana Village, Bhim Pul, and Vasudhara Falls</w:t>
+      </w:r>
+    </w:p>
+    <w:p>
+      <w:pPr>
+        <w:pStyle w:val="BodyText"/>
+        <w:numPr>
+          <w:ilvl w:val="0"/>
+          <w:numId w:val="2"/>
+        </w:numPr>
+        <w:tabs>
+          <w:tab w:val="clear" w:pos="709"/>
+          <w:tab w:val="left" w:pos="0" w:leader="none"/>
+        </w:tabs>
+        <w:spacing w:lineRule="auto" w:line="240" w:before="0" w:after="0"/>
+        <w:ind w:hanging="283" w:left="709"/>
+        <w:rPr>
+          <w:rFonts w:ascii="Times New Roman" w:hAnsi="Times New Roman"/>
+        </w:rPr>
+      </w:pPr>
+      <w:r>
+        <w:rPr>
+          <w:rFonts w:ascii="Times New Roman" w:hAnsi="Times New Roman"/>
+        </w:rPr>
+        <w:t>Badrinath to Govindghat (by road) and trek to Ghangaria (about 11 km—one way)</w:t>
+      </w:r>
+    </w:p>
+    <w:p>
+      <w:pPr>
+        <w:pStyle w:val="BodyText"/>
+        <w:numPr>
+          <w:ilvl w:val="0"/>
+          <w:numId w:val="2"/>
+        </w:numPr>
+        <w:tabs>
+          <w:tab w:val="clear" w:pos="709"/>
+          <w:tab w:val="left" w:pos="0" w:leader="none"/>
+        </w:tabs>
+        <w:spacing w:lineRule="auto" w:line="240" w:before="0" w:after="0"/>
+        <w:ind w:hanging="283" w:left="709"/>
+        <w:rPr>
+          <w:rFonts w:ascii="Times New Roman" w:hAnsi="Times New Roman"/>
+        </w:rPr>
+      </w:pPr>
+      <w:r>
+        <w:rPr>
+          <w:rFonts w:ascii="Times New Roman" w:hAnsi="Times New Roman"/>
+        </w:rPr>
+        <w:t>Ghangaria to VOF (trek)—(15 km both ways)</w:t>
+      </w:r>
+    </w:p>
+    <w:p>
+      <w:pPr>
+        <w:pStyle w:val="BodyText"/>
+        <w:numPr>
+          <w:ilvl w:val="0"/>
+          <w:numId w:val="2"/>
+        </w:numPr>
+        <w:tabs>
+          <w:tab w:val="clear" w:pos="709"/>
+          <w:tab w:val="left" w:pos="0" w:leader="none"/>
+        </w:tabs>
+        <w:spacing w:lineRule="auto" w:line="240" w:before="0" w:after="0"/>
+        <w:ind w:hanging="283" w:left="709"/>
+        <w:rPr>
+          <w:rFonts w:ascii="Times New Roman" w:hAnsi="Times New Roman"/>
+        </w:rPr>
+      </w:pPr>
+      <w:r>
+        <w:rPr>
+          <w:rFonts w:ascii="Times New Roman" w:hAnsi="Times New Roman"/>
+        </w:rPr>
+        <w:t>Ghangaria to Hemkund Sahib (trek)—(12 km both ways)</w:t>
+      </w:r>
+    </w:p>
+    <w:p>
+      <w:pPr>
+        <w:pStyle w:val="BodyText"/>
+        <w:numPr>
+          <w:ilvl w:val="0"/>
+          <w:numId w:val="2"/>
+        </w:numPr>
+        <w:tabs>
+          <w:tab w:val="clear" w:pos="709"/>
+          <w:tab w:val="left" w:pos="0" w:leader="none"/>
+        </w:tabs>
+        <w:spacing w:lineRule="auto" w:line="240" w:before="0" w:after="0"/>
+        <w:ind w:hanging="283" w:left="709"/>
+        <w:rPr>
+          <w:rFonts w:ascii="Times New Roman" w:hAnsi="Times New Roman"/>
+        </w:rPr>
+      </w:pPr>
+      <w:r>
+        <w:rPr>
+          <w:rFonts w:ascii="Times New Roman" w:hAnsi="Times New Roman"/>
+        </w:rPr>
+        <w:t>Ghangaria to Govindghat (return trek)</w:t>
+      </w:r>
+    </w:p>
+    <w:p>
+      <w:pPr>
+        <w:pStyle w:val="BodyText"/>
+        <w:numPr>
+          <w:ilvl w:val="0"/>
+          <w:numId w:val="2"/>
+        </w:numPr>
+        <w:tabs>
+          <w:tab w:val="clear" w:pos="709"/>
+          <w:tab w:val="left" w:pos="0" w:leader="none"/>
+        </w:tabs>
+        <w:spacing w:lineRule="auto" w:line="240" w:before="0" w:after="0"/>
+        <w:ind w:hanging="283" w:left="709"/>
+        <w:rPr>
+          <w:rFonts w:ascii="Times New Roman" w:hAnsi="Times New Roman"/>
+        </w:rPr>
+      </w:pPr>
+      <w:r>
+        <w:rPr>
+          <w:rFonts w:ascii="Times New Roman" w:hAnsi="Times New Roman"/>
+        </w:rPr>
+        <w:t>Govindghat to Pipalkoti (overnight stay)</w:t>
+      </w:r>
+    </w:p>
+    <w:p>
+      <w:pPr>
+        <w:pStyle w:val="BodyText"/>
+        <w:numPr>
+          <w:ilvl w:val="0"/>
+          <w:numId w:val="2"/>
+        </w:numPr>
+        <w:tabs>
+          <w:tab w:val="clear" w:pos="709"/>
+          <w:tab w:val="left" w:pos="0" w:leader="none"/>
+        </w:tabs>
+        <w:spacing w:lineRule="auto" w:line="240" w:before="0" w:after="0"/>
+        <w:ind w:hanging="283" w:left="709"/>
+        <w:rPr>
+          <w:rFonts w:ascii="Times New Roman" w:hAnsi="Times New Roman"/>
+        </w:rPr>
+      </w:pPr>
+      <w:r>
+        <w:rPr>
+          <w:rFonts w:ascii="Times New Roman" w:hAnsi="Times New Roman"/>
+        </w:rPr>
+        <w:t>Pipalkoti to Rishikesh (overnight stay)</w:t>
+      </w:r>
+    </w:p>
+    <w:p>
+      <w:pPr>
+        <w:pStyle w:val="BodyText"/>
+        <w:numPr>
+          <w:ilvl w:val="0"/>
+          <w:numId w:val="2"/>
+        </w:numPr>
+        <w:tabs>
+          <w:tab w:val="clear" w:pos="709"/>
+          <w:tab w:val="left" w:pos="0" w:leader="none"/>
+        </w:tabs>
+        <w:spacing w:lineRule="auto" w:line="240" w:before="0" w:after="0"/>
+        <w:ind w:hanging="283" w:left="709"/>
+        <w:rPr>
+          <w:rFonts w:ascii="Times New Roman" w:hAnsi="Times New Roman"/>
+        </w:rPr>
+      </w:pPr>
+      <w:r>
+        <w:rPr>
+          <w:rFonts w:ascii="Times New Roman" w:hAnsi="Times New Roman"/>
+        </w:rPr>
+        <w:t>Rishikesh to Haridwar to Delhi (by train)</w:t>
+      </w:r>
+    </w:p>
+    <w:p>
+      <w:pPr>
+        <w:pStyle w:val="BodyText"/>
+        <w:spacing w:lineRule="auto" w:line="240" w:before="0" w:after="0"/>
+        <w:rPr>
+          <w:rFonts w:ascii="Times New Roman" w:hAnsi="Times New Roman"/>
+        </w:rPr>
+      </w:pPr>
+      <w:r>
+        <w:rPr>
+          <w:rFonts w:ascii="Times New Roman" w:hAnsi="Times New Roman"/>
+        </w:rPr>
+      </w:r>
+    </w:p>
+    <w:p>
+      <w:pPr>
+        <w:pStyle w:val="BodyText"/>
+        <w:spacing w:lineRule="auto" w:line="240" w:before="0" w:after="0"/>
+        <w:rPr>
+          <w:rFonts w:ascii="Times New Roman" w:hAnsi="Times New Roman"/>
+        </w:rPr>
+      </w:pPr>
+      <w:r>
+        <w:rPr>
+          <w:rFonts w:ascii="Times New Roman" w:hAnsi="Times New Roman"/>
+        </w:rPr>
+        <w:t>While I do not want to go into the details about the hotels and the stays, I just wanted to share the highlights from this trip. To start with, Vasudhara Falls turned out to be an absolute gift of the divine force. Personally, this was my 5th trip to Badrinath (previously visited in 1992, 1994, 1998, and 2008), and every previous attempt to reach Vasudhara Falls failed—merely by looking at the daunting, arduous cobblestone pathway. Yes. In spite of my youthfulness to support me, I would simply return after trekking for a couple of meters. But this time, fortune favored the brave, defying old age and its related ailments. Thanks to my good friend and her spouse for their keenness in getting a firsthand experience of trekking in the Himalayas, my wife and I attempted this trek. At several places, my body literally gave up and was forcing my mind to retreat. But the strength of mind prevailed. At halfway through the trek, the sight of a tall waterfall with its milky water flowing down was a perfect motivation. Egged on by passersby, we slowly approached the waterfall. And my eyes could not believe the sheer sight of what I was witnessing in front of me. Let my photos convey what I witnessed. I had not known the story behind this place. The falls are considered a gateway to heaven because the Pandavas apparently went this way. The side story is that Bhim Pul (Bhim's Bridge) was made by Bhim, who pushed a huge rock over the Pushpavati River so that his brothers and Draupadi could cross the river! The view of Bhim Pul is also something one should not miss. It is right after Mana Village (the first or the last village), depending on how one looks at it!</w:t>
+      </w:r>
+    </w:p>
+    <w:p>
+      <w:pPr>
+        <w:pStyle w:val="BodyText"/>
+        <w:spacing w:lineRule="auto" w:line="240" w:before="0" w:after="0"/>
+        <w:rPr>
+          <w:rFonts w:ascii="Times New Roman" w:hAnsi="Times New Roman"/>
+        </w:rPr>
+      </w:pPr>
+      <w:r>
+        <w:rPr>
+          <w:rFonts w:ascii="Times New Roman" w:hAnsi="Times New Roman"/>
+        </w:rPr>
+      </w:r>
+    </w:p>
+    <w:p>
+      <w:pPr>
+        <w:pStyle w:val="BodyText"/>
+        <w:spacing w:lineRule="auto" w:line="240" w:before="0" w:after="0"/>
+        <w:rPr>
+          <w:rFonts w:ascii="Times New Roman" w:hAnsi="Times New Roman"/>
+        </w:rPr>
+      </w:pPr>
+      <w:r>
+        <w:rPr>
+          <w:rFonts w:ascii="Times New Roman" w:hAnsi="Times New Roman"/>
+        </w:rPr>
+        <w:t>So, with the icy water droplets sprinkling over us due to the wind, we received the blessings of the Almighty for having visited the gateway to heaven! And throughout that day, until we hit the bed, our thoughts and talks were only about how wonderful the trek to Vasudhara Falls was. Thankfully, it is not commercialized and has retained its pristine beauty. Hopefully, it remains so.</w:t>
+      </w:r>
+    </w:p>
+    <w:p>
+      <w:pPr>
+        <w:pStyle w:val="Normal"/>
+        <w:bidi w:val="0"/>
+        <w:spacing w:lineRule="auto" w:line="240" w:before="0" w:after="0"/>
+        <w:jc w:val="left"/>
+        <w:rPr>
+          <w:rFonts w:ascii="Times New Roman" w:hAnsi="Times New Roman"/>
+          <w:b w:val="false"/>
+          <w:bCs w:val="false"/>
+          <w:sz w:val="24"/>
+          <w:szCs w:val="24"/>
+        </w:rPr>
+      </w:pPr>
+      <w:r>
+        <w:rPr>
+          <w:rFonts w:ascii="Times New Roman" w:hAnsi="Times New Roman"/>
+          <w:b w:val="false"/>
+          <w:bCs w:val="false"/>
+          <w:sz w:val="24"/>
+          <w:szCs w:val="24"/>
+        </w:rPr>
+      </w:r>
+      <w:r>
+        <w:br w:type="page"/>
+      </w:r>
+    </w:p>
+    <w:p>
+      <w:pPr>
+        <w:pStyle w:val="Normal"/>
+        <w:bidi w:val="0"/>
+        <w:spacing w:lineRule="auto" w:line="240" w:before="0" w:after="0"/>
+        <w:jc w:val="left"/>
+        <w:rPr>
+          <w:rFonts w:ascii="Times New Roman" w:hAnsi="Times New Roman"/>
+        </w:rPr>
+      </w:pPr>
+      <w:r>
+        <w:rPr>
+          <w:rFonts w:ascii="Times New Roman" w:hAnsi="Times New Roman"/>
+          <w:b/>
+          <w:bCs/>
+          <w:sz w:val="24"/>
+          <w:szCs w:val="24"/>
+        </w:rPr>
         <w:t xml:space="preserve">Megamalai (Tamil Nadu) - </w:t>
       </w:r>
       <w:r>
@@ -4313,7 +4821,7 @@
     <w:sectPr>
       <w:type w:val="nextPage"/>
       <w:pgSz w:w="11906" w:h="16838"/>
-      <w:pgMar w:left="1134" w:right="1134" w:gutter="0" w:header="0" w:top="1134" w:footer="0" w:bottom="1134"/>
+      <w:pgMar w:left="1134" w:right="1134" w:gutter="0" w:header="0" w:top="1134" w:footer="0" w:bottom="586"/>
       <w:pgNumType w:fmt="decimal"/>
       <w:formProt w:val="false"/>
       <w:textDirection w:val="lrTb"/>
@@ -4465,6 +4973,143 @@
   <w:abstractNum w:abstractNumId="2">
     <w:lvl w:ilvl="0">
       <w:start w:val="1"/>
+      <w:numFmt w:val="bullet"/>
+      <w:lvlText w:val=""/>
+      <w:lvlJc w:val="left"/>
+      <w:pPr>
+        <w:tabs>
+          <w:tab w:val="num" w:pos="709"/>
+        </w:tabs>
+        <w:ind w:left="709" w:hanging="283"/>
+      </w:pPr>
+      <w:rPr>
+        <w:rFonts w:ascii="Symbol" w:hAnsi="Symbol" w:cs="Symbol" w:hint="default"/>
+      </w:rPr>
+    </w:lvl>
+    <w:lvl w:ilvl="1">
+      <w:start w:val="1"/>
+      <w:numFmt w:val="bullet"/>
+      <w:lvlText w:val=""/>
+      <w:lvlJc w:val="left"/>
+      <w:pPr>
+        <w:tabs>
+          <w:tab w:val="num" w:pos="1418"/>
+        </w:tabs>
+        <w:ind w:left="1418" w:hanging="283"/>
+      </w:pPr>
+      <w:rPr>
+        <w:rFonts w:ascii="Symbol" w:hAnsi="Symbol" w:cs="Symbol" w:hint="default"/>
+      </w:rPr>
+    </w:lvl>
+    <w:lvl w:ilvl="2">
+      <w:start w:val="1"/>
+      <w:numFmt w:val="bullet"/>
+      <w:lvlText w:val=""/>
+      <w:lvlJc w:val="left"/>
+      <w:pPr>
+        <w:tabs>
+          <w:tab w:val="num" w:pos="2127"/>
+        </w:tabs>
+        <w:ind w:left="2127" w:hanging="283"/>
+      </w:pPr>
+      <w:rPr>
+        <w:rFonts w:ascii="Symbol" w:hAnsi="Symbol" w:cs="Symbol" w:hint="default"/>
+      </w:rPr>
+    </w:lvl>
+    <w:lvl w:ilvl="3">
+      <w:start w:val="1"/>
+      <w:numFmt w:val="bullet"/>
+      <w:lvlText w:val=""/>
+      <w:lvlJc w:val="left"/>
+      <w:pPr>
+        <w:tabs>
+          <w:tab w:val="num" w:pos="2836"/>
+        </w:tabs>
+        <w:ind w:left="2836" w:hanging="283"/>
+      </w:pPr>
+      <w:rPr>
+        <w:rFonts w:ascii="Symbol" w:hAnsi="Symbol" w:cs="Symbol" w:hint="default"/>
+      </w:rPr>
+    </w:lvl>
+    <w:lvl w:ilvl="4">
+      <w:start w:val="1"/>
+      <w:numFmt w:val="bullet"/>
+      <w:lvlText w:val=""/>
+      <w:lvlJc w:val="left"/>
+      <w:pPr>
+        <w:tabs>
+          <w:tab w:val="num" w:pos="3545"/>
+        </w:tabs>
+        <w:ind w:left="3545" w:hanging="283"/>
+      </w:pPr>
+      <w:rPr>
+        <w:rFonts w:ascii="Symbol" w:hAnsi="Symbol" w:cs="Symbol" w:hint="default"/>
+      </w:rPr>
+    </w:lvl>
+    <w:lvl w:ilvl="5">
+      <w:start w:val="1"/>
+      <w:numFmt w:val="bullet"/>
+      <w:lvlText w:val=""/>
+      <w:lvlJc w:val="left"/>
+      <w:pPr>
+        <w:tabs>
+          <w:tab w:val="num" w:pos="4254"/>
+        </w:tabs>
+        <w:ind w:left="4254" w:hanging="283"/>
+      </w:pPr>
+      <w:rPr>
+        <w:rFonts w:ascii="Symbol" w:hAnsi="Symbol" w:cs="Symbol" w:hint="default"/>
+      </w:rPr>
+    </w:lvl>
+    <w:lvl w:ilvl="6">
+      <w:start w:val="1"/>
+      <w:numFmt w:val="bullet"/>
+      <w:lvlText w:val=""/>
+      <w:lvlJc w:val="left"/>
+      <w:pPr>
+        <w:tabs>
+          <w:tab w:val="num" w:pos="4963"/>
+        </w:tabs>
+        <w:ind w:left="4963" w:hanging="283"/>
+      </w:pPr>
+      <w:rPr>
+        <w:rFonts w:ascii="Symbol" w:hAnsi="Symbol" w:cs="Symbol" w:hint="default"/>
+      </w:rPr>
+    </w:lvl>
+    <w:lvl w:ilvl="7">
+      <w:start w:val="1"/>
+      <w:numFmt w:val="bullet"/>
+      <w:lvlText w:val=""/>
+      <w:lvlJc w:val="left"/>
+      <w:pPr>
+        <w:tabs>
+          <w:tab w:val="num" w:pos="5672"/>
+        </w:tabs>
+        <w:ind w:left="5672" w:hanging="283"/>
+      </w:pPr>
+      <w:rPr>
+        <w:rFonts w:ascii="Symbol" w:hAnsi="Symbol" w:cs="Symbol" w:hint="default"/>
+      </w:rPr>
+    </w:lvl>
+    <w:lvl w:ilvl="8">
+      <w:start w:val="1"/>
+      <w:numFmt w:val="bullet"/>
+      <w:lvlText w:val=""/>
+      <w:lvlJc w:val="left"/>
+      <w:pPr>
+        <w:tabs>
+          <w:tab w:val="num" w:pos="6381"/>
+        </w:tabs>
+        <w:ind w:left="6381" w:hanging="283"/>
+      </w:pPr>
+      <w:rPr>
+        <w:rFonts w:ascii="Symbol" w:hAnsi="Symbol" w:cs="Symbol" w:hint="default"/>
+      </w:rPr>
+    </w:lvl>
+  </w:abstractNum>
+  <w:abstractNum w:abstractNumId="3">
+    <w:lvl w:ilvl="0">
+      <w:start w:val="1"/>
       <w:numFmt w:val="none"/>
       <w:suff w:val="nothing"/>
       <w:lvlText w:val=""/>
@@ -4586,6 +5231,9 @@
   </w:num>
   <w:num w:numId="2">
     <w:abstractNumId w:val="2"/>
+  </w:num>
+  <w:num w:numId="3">
+    <w:abstractNumId w:val="3"/>
   </w:num>
 </w:numbering>
 </file>
@@ -4678,6 +5326,13 @@
     <w:name w:val="Numbering Symbols"/>
     <w:qFormat/>
     <w:rPr/>
+  </w:style>
+  <w:style w:type="character" w:styleId="Bullets">
+    <w:name w:val="Bullets"/>
+    <w:qFormat/>
+    <w:rPr>
+      <w:rFonts w:ascii="OpenSymbol" w:hAnsi="OpenSymbol" w:eastAsia="OpenSymbol" w:cs="OpenSymbol"/>
+    </w:rPr>
   </w:style>
   <w:style w:type="paragraph" w:styleId="Heading">
     <w:name w:val="Heading"/>

</xml_diff>